<commit_message>
feat: implement recurring payments workflow configuration and management modules
</commit_message>
<xml_diff>
--- a/docs/E-Approval-Manual.docx
+++ b/docs/E-Approval-Manual.docx
@@ -55,7 +55,7 @@
           <w:sz w:val="18"/>
           <w:szCs w:val="18"/>
         </w:rPr>
-        <w:t xml:space="preserve">Version 1.0  ·  9 September 2026</w:t>
+        <w:t xml:space="preserve">Version 1.0  ·  5 October 2026</w:t>
       </w:r>
     </w:p>
     <w:p>
@@ -761,7 +761,7 @@
           <w:sz w:val="18"/>
           <w:szCs w:val="18"/>
         </w:rPr>
-        <w:t xml:space="preserve"> — Change control, approver powers, recall, reminders and numbering.</w:t>
+        <w:t xml:space="preserve"> — Six tabs: approver powers, who to send to, editing after approval, deadlines, undo and numbering.</w:t>
       </w:r>
     </w:p>
     <w:p>
@@ -819,7 +819,7 @@
           <w:sz w:val="18"/>
           <w:szCs w:val="18"/>
         </w:rPr>
-        <w:t xml:space="preserve"> — Reminders and escalations need a scheduler.</w:t>
+        <w:t xml:space="preserve"> — Reminders and escalations run every hour.</w:t>
       </w:r>
     </w:p>
     <w:p>
@@ -2477,7 +2477,7 @@
                 <w:sz w:val="19"/>
                 <w:szCs w:val="19"/>
               </w:rPr>
-              <w:t xml:space="preserve">The chain as it actually happened. Verifications appear indented inside the approver who asked for them, with the arrow back.</w:t>
+              <w:t xml:space="preserve">The chain as it actually happened, drawn as a tree. Everyone who held the file is a step of their own — a forward adds the next person underneath — and the covering note, instruction or remark each of them wrote appears at their step, with their name and the time. Verifications and clarifications appear indented inside the person who asked for them, with the arrow back.</w:t>
             </w:r>
           </w:p>
         </w:tc>
@@ -2643,6 +2643,14 @@
       <w:pPr>
         <w:spacing w:after="120"/>
       </w:pPr>
+    </w:p>
+    <w:p>
+      <w:pPr>
+        <w:spacing w:after="120"/>
+      </w:pPr>
+      <w:r>
+        <w:t xml:space="preserve">Print produces the Approval Note: the proposal, then a row for every person the file passed through with what they wrote, then the remarks and attachments. A wide proposal table is shrunk to fit the width of A4 portrait — it never runs off the edge of the paper, whatever the print dialog's scaling is set to. When shrinking would make the figures hard to read, the print bar says so and offers landscape instead.</w:t>
+      </w:r>
     </w:p>
     <w:p>
       <w:pPr>
@@ -2681,6 +2689,29 @@
       </w:pPr>
       <w:r>
         <w:t xml:space="preserve">An approver can return a request for correction. It appears in your inbox marked Returned, with the reason. Open it, choose Edit, make the correction, save, then use Resubmit on the approval screen.</w:t>
+      </w:r>
+    </w:p>
+    <w:p>
+      <w:pPr>
+        <w:pBdr>
+          <w:left w:val="single" w:sz="18" w:space="8" w:color="38BDF8"/>
+        </w:pBdr>
+        <w:shd w:val="clear" w:color="auto" w:fill="F0F9FF"/>
+        <w:spacing w:before="80" w:after="140"/>
+        <w:ind w:left="170"/>
+      </w:pPr>
+      <w:r>
+        <w:rPr>
+          <w:b/>
+          <w:color w:val="0369A1"/>
+        </w:rPr>
+        <w:t xml:space="preserve">Note   </w:t>
+      </w:r>
+      <w:r>
+        <w:rPr>
+          <w:color w:val="0C4A6E"/>
+        </w:rPr>
+        <w:t xml:space="preserve">A request returned to you is always yours to correct — no permission is needed for your own file. Correcting somebody else’s returned request, to finish it while they are on leave, needs the "Requests → Edit" permission; they still have to resubmit it themselves.</w:t>
       </w:r>
     </w:p>
     <w:p>
@@ -2884,6 +2915,29 @@
           <w:color w:val="0C4A6E"/>
         </w:rPr>
         <w:t xml:space="preserve">Nothing else on an approval can be deleted once posted. That is what makes the file usable as evidence months later.</w:t>
+      </w:r>
+    </w:p>
+    <w:p>
+      <w:pPr>
+        <w:pBdr>
+          <w:left w:val="single" w:sz="18" w:space="8" w:color="38BDF8"/>
+        </w:pBdr>
+        <w:shd w:val="clear" w:color="auto" w:fill="F0F9FF"/>
+        <w:spacing w:before="80" w:after="140"/>
+        <w:ind w:left="170"/>
+      </w:pPr>
+      <w:r>
+        <w:rPr>
+          <w:b/>
+          <w:color w:val="0369A1"/>
+        </w:rPr>
+        <w:t xml:space="preserve">Note   </w:t>
+      </w:r>
+      <w:r>
+        <w:rPr>
+          <w:color w:val="0C4A6E"/>
+        </w:rPr>
+        <w:t xml:space="preserve">The request itself can be deleted while it is still your draft — Delete draft, on the draft or its edit screen. Once submitted, use Cancel instead: that closes it and keeps the record. Removing a submitted approval outright needs the separate "Requests → Delete" permission and is meant for a file that should never have existed.</w:t>
       </w:r>
     </w:p>
     <w:p>
@@ -3425,6 +3479,45 @@
                 <w:szCs w:val="19"/>
               </w:rPr>
               <w:t xml:space="preserve">Ask a question. The answer returns to you the same way.</w:t>
+            </w:r>
+          </w:p>
+        </w:tc>
+      </w:tr>
+      <w:tr>
+        <w:tc>
+          <w:tcPr>
+            <w:tcW w:w="2891" w:type="dxa"/>
+            <w:vAlign w:val="top"/>
+          </w:tcPr>
+          <w:p>
+            <w:pPr>
+              <w:spacing w:before="40" w:after="40"/>
+            </w:pPr>
+            <w:r>
+              <w:rPr>
+                <w:b/>
+                <w:sz w:val="19"/>
+                <w:szCs w:val="19"/>
+              </w:rPr>
+              <w:t xml:space="preserve">Asked to clarify yourself?</w:t>
+            </w:r>
+          </w:p>
+        </w:tc>
+        <w:tc>
+          <w:tcPr>
+            <w:tcW w:w="6747" w:type="dxa"/>
+            <w:vAlign w:val="top"/>
+          </w:tcPr>
+          <w:p>
+            <w:pPr>
+              <w:spacing w:before="40" w:after="40"/>
+            </w:pPr>
+            <w:r>
+              <w:rPr>
+                <w:sz w:val="19"/>
+                <w:szCs w:val="19"/>
+              </w:rPr>
+              <w:t xml:space="preserve">You can ask onward. Somebody asked to clarify keeps Send for Verification and Request Clarification, so a question you cannot answer goes to whoever can — and the answer comes back up the same chain, to you and then to whoever asked you. You are never forced to answer from memory or hand the whole question away.</w:t>
             </w:r>
           </w:p>
         </w:tc>
@@ -6355,7 +6448,7 @@
           <w:sz w:val="19"/>
           <w:szCs w:val="19"/>
         </w:rPr>
-        <w:t xml:space="preserve">Change control, approver powers, recall, reminders and numbering.</w:t>
+        <w:t xml:space="preserve">Six tabs: approver powers, who to send to, editing after approval, deadlines, undo and numbering.</w:t>
       </w:r>
       <w:r>
         <w:rPr>
@@ -6372,7 +6465,7 @@
         <w:spacing w:after="120"/>
       </w:pPr>
       <w:r>
-        <w:t xml:space="preserve">Five groups of settings, all held in one record and saved together.</w:t>
+        <w:t xml:space="preserve">Six tabs of settings, all held in one record and saved together. A tab with unsaved changes carries an orange dot, and the bar at the bottom names every tab you have changed — click a name to go back to it — until you save or discard. The tab you are on is kept in the page address, so a link to …/policies#reminders opens straight on that tab.</w:t>
       </w:r>
     </w:p>
     <w:p>
@@ -6380,7 +6473,23 @@
         <w:spacing w:after="120"/>
       </w:pPr>
       <w:r>
-        <w:t xml:space="preserve">Change control — which edits invalidate approvals already given.</w:t>
+        <w:t xml:space="preserve">What approvers can do — organisation-wide ceilings: sending for further verification and how many levels deep, returning to any earlier step, whether a return goes through the requester, Approve &amp; Complete, and automatic sign-off of a stage that lands on the requester. A workflow stage can switch any of these off for itself; it can never switch one on that is off here.</w:t>
+      </w:r>
+    </w:p>
+    <w:p>
+      <w:pPr>
+        <w:spacing w:after="120"/>
+      </w:pPr>
+      <w:r>
+        <w:t xml:space="preserve">Who to send to — the choices offered when somebody picks an approver on the request form or in the Forward, Delegate, Add approver and verification dialogs: Person, Department, Project and Designation. Person is always on, because a form on which nobody can be named cannot be submitted. Workflows and the approval matrix keep all four, so switching one off here never breaks a workflow that already uses it.</w:t>
+      </w:r>
+    </w:p>
+    <w:p>
+      <w:pPr>
+        <w:spacing w:after="120"/>
+      </w:pPr>
+      <w:r>
+        <w:t xml:space="preserve">Editing after approval — which fields, when changed, cancel the approvals already given. Small amount changes allowed treats a change within that percentage as a correction; 0 means any change counts. Restart-from decides where approval begins again.</w:t>
       </w:r>
     </w:p>
     <w:p>
@@ -6403,7 +6512,7 @@
         <w:rPr>
           <w:color w:val="7C2D12"/>
         </w:rPr>
-        <w:t xml:space="preserve">Leave Amount ticked unless you have a specific reason. With it off, a figure can be raised after approval without superseding anything.</w:t>
+        <w:t xml:space="preserve">Leave Amount selected unless you have a specific reason. With it off, a figure can be raised after approval without cancelling anything.</w:t>
       </w:r>
     </w:p>
     <w:p>
@@ -6411,7 +6520,7 @@
         <w:spacing w:after="120"/>
       </w:pPr>
       <w:r>
-        <w:t xml:space="preserve">Amount tolerance treats a change within that percentage as a correction rather than a new proposal; 0 means any change supersedes. Restart-from decides where the chain resumes afterwards.</w:t>
+        <w:t xml:space="preserve">Deadlines &amp; reminders — the default time per step, and the reminder schedule, measured from when a step started waiting and excluding time on hold. "Use recommended" restores the standard schedule; "Run now" processes it on demand. Saving with no rules at all uses the recommended schedule.</w:t>
       </w:r>
     </w:p>
     <w:p>
@@ -6419,7 +6528,7 @@
         <w:spacing w:after="120"/>
       </w:pPr>
       <w:r>
-        <w:t xml:space="preserve">What approvers may do — organisation-wide ceilings on nesting depth, return-to-any-step and approve-&amp;-complete. A workflow stage can switch any of these off for itself; it can never switch one on that is off here.</w:t>
+        <w:t xml:space="preserve">Undoing actions — recall and reversal, their on/off switches and time limits. See 2.5.</w:t>
       </w:r>
     </w:p>
     <w:p>
@@ -6427,23 +6536,7 @@
         <w:spacing w:after="120"/>
       </w:pPr>
       <w:r>
-        <w:t xml:space="preserve">Recall &amp; reverse — the two windows and their on/off switches. See 2.5.</w:t>
-      </w:r>
-    </w:p>
-    <w:p>
-      <w:pPr>
-        <w:spacing w:after="120"/>
-      </w:pPr>
-      <w:r>
-        <w:t xml:space="preserve">Reminders &amp; escalation — the ladder, measured from when a step became active and excluding time paused. Each rule carries a level from Level 1 to Management. "Run now" processes it on demand.</w:t>
-      </w:r>
-    </w:p>
-    <w:p>
-      <w:pPr>
-        <w:spacing w:after="120"/>
-      </w:pPr>
-      <w:r>
-        <w:t xml:space="preserve">Numbering — prefix, separator, digits, and whether the department code appears. The example updates as you type.</w:t>
+        <w:t xml:space="preserve">Reference numbers — prefix, separator, digits, and whether the department code appears. The example updates as you type.</w:t>
       </w:r>
     </w:p>
     <w:p>
@@ -6627,7 +6720,85 @@
                 <w:sz w:val="19"/>
                 <w:szCs w:val="19"/>
               </w:rPr>
-              <w:t xml:space="preserve">Create, edit, delete a draft, cancel, and how much of the register you can see.</w:t>
+              <w:t xml:space="preserve">Create, delete a draft, cancel, and how much of the register you can see.</w:t>
+            </w:r>
+          </w:p>
+        </w:tc>
+      </w:tr>
+      <w:tr>
+        <w:tc>
+          <w:tcPr>
+            <w:tcW w:w="2891" w:type="dxa"/>
+            <w:vAlign w:val="top"/>
+          </w:tcPr>
+          <w:p>
+            <w:pPr>
+              <w:spacing w:before="40" w:after="40"/>
+            </w:pPr>
+            <w:r>
+              <w:rPr>
+                <w:b/>
+                <w:sz w:val="19"/>
+                <w:szCs w:val="19"/>
+              </w:rPr>
+              <w:t xml:space="preserve">Requests → Edit</w:t>
+            </w:r>
+          </w:p>
+        </w:tc>
+        <w:tc>
+          <w:tcPr>
+            <w:tcW w:w="6747" w:type="dxa"/>
+            <w:vAlign w:val="top"/>
+          </w:tcPr>
+          <w:p>
+            <w:pPr>
+              <w:spacing w:before="40" w:after="40"/>
+            </w:pPr>
+            <w:r>
+              <w:rPr>
+                <w:sz w:val="19"/>
+                <w:szCs w:val="19"/>
+              </w:rPr>
+              <w:t xml:space="preserve">Correcting a returned request that is not your own. Nobody needs it for their own work — your own draft, and your own file returned for correction, are always yours to change.</w:t>
+            </w:r>
+          </w:p>
+        </w:tc>
+      </w:tr>
+      <w:tr>
+        <w:tc>
+          <w:tcPr>
+            <w:tcW w:w="2891" w:type="dxa"/>
+            <w:vAlign w:val="top"/>
+          </w:tcPr>
+          <w:p>
+            <w:pPr>
+              <w:spacing w:before="40" w:after="40"/>
+            </w:pPr>
+            <w:r>
+              <w:rPr>
+                <w:b/>
+                <w:sz w:val="19"/>
+                <w:szCs w:val="19"/>
+              </w:rPr>
+              <w:t xml:space="preserve">Requests → Delete</w:t>
+            </w:r>
+          </w:p>
+        </w:tc>
+        <w:tc>
+          <w:tcPr>
+            <w:tcW w:w="6747" w:type="dxa"/>
+            <w:vAlign w:val="top"/>
+          </w:tcPr>
+          <w:p>
+            <w:pPr>
+              <w:spacing w:before="40" w:after="40"/>
+            </w:pPr>
+            <w:r>
+              <w:rPr>
+                <w:sz w:val="19"/>
+                <w:szCs w:val="19"/>
+              </w:rPr>
+              <w:t xml:space="preserve">Deleting a request that has already been submitted, together with its whole workflow — the stages, the audit trail, the comments, the attachments and the superseded versions. Grant it to nobody unless somebody genuinely needs it; Cancel closes a file and keeps the record. The deletion itself, with its reason, stays in the activity log.</w:t>
             </w:r>
           </w:p>
         </w:tc>
@@ -7001,7 +7172,7 @@
           <w:sz w:val="19"/>
           <w:szCs w:val="19"/>
         </w:rPr>
-        <w:t xml:space="preserve">Reminders and escalations need a scheduler.</w:t>
+        <w:t xml:space="preserve">Reminders and escalations run every hour.</w:t>
       </w:r>
     </w:p>
     <w:p>
@@ -7009,7 +7180,7 @@
         <w:spacing w:after="120"/>
       </w:pPr>
       <w:r>
-        <w:t xml:space="preserve">The endpoint /api/e-approval/escalations processes the ladder. It is safe to call as often as you like — each step records which rules have already fired, so nothing is sent twice.</w:t>
+        <w:t xml:space="preserve">The endpoint /api/e-approval/escalations processes the ladder. It is scheduled to run every hour (at twenty past) in vercel.json, alongside the other modules' scheduled jobs. It is safe to call as often as you like — each step records which rules have already fired, so nothing is sent twice. The "Run now" button on the Policies page runs the same sweep on demand.</w:t>
       </w:r>
     </w:p>
     <w:p>
@@ -7032,7 +7203,7 @@
         <w:rPr>
           <w:color w:val="7C2D12"/>
         </w:rPr>
-        <w:t xml:space="preserve">Until this is scheduled, no reminder or escalation is ever sent. The "Run now" button on the Policies page is a manual substitute, not a replacement.</w:t>
+        <w:t xml:space="preserve">On the first run after the schedule was switched on, a file that had already been waiting a long time receives every reminder it had missed at once — a file stuck for four days produces its reminders, its escalation to the HOD and its notice to the requester together. Expect that burst once; afterwards each rule fires at its own time.</w:t>
       </w:r>
     </w:p>
     <w:p>
@@ -7055,7 +7226,7 @@
         <w:rPr>
           <w:color w:val="0C4A6E"/>
         </w:rPr>
-        <w:t xml:space="preserve">Guard the endpoint with the CRON_SECRET environment variable if it is reachable publicly.</w:t>
+        <w:t xml:space="preserve">Set the CRON_SECRET environment variable in the hosting project. Without it the endpoint answers anyone who calls it; with it, only the scheduler can.</w:t>
       </w:r>
     </w:p>
     <w:p>
@@ -7579,7 +7750,7 @@
         <w:t xml:space="preserve">•</w:t>
       </w:r>
       <w:r>
-        <w:t xml:space="preserve">  No other module yet routes its approvals through this engine, though it is built to accept them.</w:t>
+        <w:t xml:space="preserve">  Recurring Payments raises its approvals through this engine; the other modules do not yet, though it is built to accept them.</w:t>
       </w:r>
     </w:p>
     <w:p>

</xml_diff>

<commit_message>
feat: implement E-Approval domain logic, manual documentation, services, and UI layout components
</commit_message>
<xml_diff>
--- a/docs/E-Approval-Manual.docx
+++ b/docs/E-Approval-Manual.docx
@@ -1610,6 +1610,45 @@
                 <w:sz w:val="19"/>
                 <w:szCs w:val="19"/>
               </w:rPr>
+              <w:t xml:space="preserve">Copied to Me</w:t>
+            </w:r>
+          </w:p>
+        </w:tc>
+        <w:tc>
+          <w:tcPr>
+            <w:tcW w:w="6747" w:type="dxa"/>
+            <w:vAlign w:val="top"/>
+          </w:tcPr>
+          <w:p>
+            <w:pPr>
+              <w:spacing w:before="40" w:after="40"/>
+            </w:pPr>
+            <w:r>
+              <w:rPr>
+                <w:sz w:val="19"/>
+                <w:szCs w:val="19"/>
+              </w:rPr>
+              <w:t xml:space="preserve">Requests someone has put you in CC on, with their status and who they are pending with. You can follow and comment; you are not asked to act.</w:t>
+            </w:r>
+          </w:p>
+        </w:tc>
+      </w:tr>
+      <w:tr>
+        <w:tc>
+          <w:tcPr>
+            <w:tcW w:w="2891" w:type="dxa"/>
+            <w:vAlign w:val="top"/>
+          </w:tcPr>
+          <w:p>
+            <w:pPr>
+              <w:spacing w:before="40" w:after="40"/>
+            </w:pPr>
+            <w:r>
+              <w:rPr>
+                <w:b/>
+                <w:sz w:val="19"/>
+                <w:szCs w:val="19"/>
+              </w:rPr>
               <w:t xml:space="preserve">Drafts</w:t>
             </w:r>
           </w:p>
@@ -2105,7 +2144,7 @@
         <w:t xml:space="preserve">•</w:t>
       </w:r>
       <w:r>
-        <w:t xml:space="preserve">  Visibility — CC people who should see it, and mark the file confidential.</w:t>
+        <w:t xml:space="preserve">  Visibility — CC people who should see it, and mark the file confidential. Everyone in CC is notified when you submit, finds the request under Copied to Me, and is told again when it is finally approved or rejected — not at every step in between. Taking someone off CC while editing takes away their access too.</w:t>
       </w:r>
     </w:p>
     <w:p>

</xml_diff>

<commit_message>
feat: add e-approval module with export utilities and project registration views
</commit_message>
<xml_diff>
--- a/docs/E-Approval-Manual.docx
+++ b/docs/E-Approval-Manual.docx
@@ -55,7 +55,7 @@
           <w:sz w:val="18"/>
           <w:szCs w:val="18"/>
         </w:rPr>
-        <w:t xml:space="preserve">Version 1.0  ·  5 October 2026</w:t>
+        <w:t xml:space="preserve">Version 1.0  ·  10 October 2026</w:t>
       </w:r>
     </w:p>
     <w:p>
@@ -1950,6 +1950,14 @@
       <w:pPr>
         <w:spacing w:after="120"/>
       </w:pPr>
+    </w:p>
+    <w:p>
+      <w:pPr>
+        <w:spacing w:after="120"/>
+      </w:pPr>
+      <w:r>
+        <w:t xml:space="preserve">Every list has an Export to Excel button for anyone holding the E-Approval Export permission. It saves what the list is showing — after any search or status filter — as a workbook with six sheets: Requests (every field, with dates and amounts you can sort, filter and total), Workflow, Activity, Comments, Attachments (by name; the files stay in the app) and a note of who exported what. A confidential request you cannot open is listed with its summary only.</w:t>
+      </w:r>
     </w:p>
     <w:p>
       <w:pPr>

</xml_diff>